<commit_message>
Add bug report for Daraz mobile app covering UI, functionality, and usability issues
This commit includes a documented analysis of 5 bugs identified during manual testing of the Daraz mobile app (Android version). The issues span across UI, functionality, and usability categories.

Details include:
- UI overlap in search placeholder
- Missing phone number validation in OTP login
- Login button hidden behind the keyboard
- Cart icon not updating item count in real-time
- Inconsistent font sizes across product pages

Each bug includes steps to reproduce, expected vs actual behavior, and the affected screen or component. This report can serve as a base for QA tracking, future automated test scenarios, or issue creation on a bug-tracking platform like Jira.
</commit_message>
<xml_diff>
--- a/Week3_Web&Mobile_App_Testing.docx
+++ b/Week3_Web&Mobile_App_Testing.docx
@@ -65,13 +65,22 @@
           <w:szCs w:val="26"/>
           <w:rtl w:val="0"/>
         </w:rPr>
-        <w:t xml:space="preserve">Cross-Browsing Testing</w:t>
-      </w:r>
-    </w:p>
-    <w:p>
-      <w:pPr>
-        <w:rPr/>
-      </w:pPr>
+        <w:t xml:space="preserve">Cross-Browsing Testing </w:t>
+      </w:r>
+    </w:p>
+    <w:p>
+      <w:pPr>
+        <w:rPr>
+          <w:b w:val="1"/>
+        </w:rPr>
+      </w:pPr>
+      <w:r>
+        <w:rPr>
+          <w:b w:val="1"/>
+          <w:rtl w:val="0"/>
+        </w:rPr>
+        <w:t xml:space="preserve">Test OrangeHRM</w:t>
+      </w:r>
       <w:r>
         <w:rPr>
           <w:rtl w:val="0"/>
@@ -2341,23 +2350,969 @@
         <w:ind w:left="-425.19685039370086" w:hanging="420"/>
         <w:rPr>
           <w:b w:val="1"/>
+          <w:color w:val="1155cc"/>
+          <w:sz w:val="26"/>
+          <w:szCs w:val="26"/>
+        </w:rPr>
+      </w:pPr>
+      <w:r>
+        <w:rPr>
+          <w:b w:val="1"/>
           <w:sz w:val="24"/>
           <w:szCs w:val="24"/>
-        </w:rPr>
-      </w:pPr>
-      <w:r>
-        <w:rPr>
-          <w:rtl w:val="0"/>
-        </w:rPr>
-      </w:r>
-    </w:p>
-    <w:p>
-      <w:pPr>
-        <w:ind w:left="-425.19685039370086" w:hanging="420"/>
-        <w:rPr>
-          <w:b w:val="1"/>
-          <w:sz w:val="24"/>
-          <w:szCs w:val="24"/>
+          <w:rtl w:val="0"/>
+        </w:rPr>
+        <w:tab/>
+      </w:r>
+      <w:r>
+        <w:rPr>
+          <w:b w:val="1"/>
+          <w:color w:val="1155cc"/>
+          <w:sz w:val="26"/>
+          <w:szCs w:val="26"/>
+          <w:rtl w:val="0"/>
+        </w:rPr>
+        <w:t xml:space="preserve">Daraz Mobile App Testing</w:t>
+      </w:r>
+    </w:p>
+    <w:p>
+      <w:pPr>
+        <w:ind w:left="-425.19685039370086" w:hanging="420"/>
+        <w:rPr>
+          <w:b w:val="1"/>
+          <w:color w:val="1155cc"/>
+          <w:sz w:val="26"/>
+          <w:szCs w:val="26"/>
+        </w:rPr>
+      </w:pPr>
+      <w:r>
+        <w:rPr>
+          <w:rtl w:val="0"/>
+        </w:rPr>
+      </w:r>
+    </w:p>
+    <w:p>
+      <w:pPr>
+        <w:ind w:left="-425.19685039370086" w:hanging="420"/>
+        <w:rPr/>
+      </w:pPr>
+      <w:r>
+        <w:rPr>
+          <w:rtl w:val="0"/>
+        </w:rPr>
+        <w:tab/>
+      </w:r>
+      <w:r>
+        <w:rPr>
+          <w:b w:val="1"/>
+          <w:rtl w:val="0"/>
+        </w:rPr>
+        <w:t xml:space="preserve">Bug 1</w:t>
+      </w:r>
+      <w:r>
+        <w:rPr>
+          <w:rtl w:val="0"/>
+        </w:rPr>
+        <w:t xml:space="preserve">: </w:t>
+      </w:r>
+      <w:r>
+        <w:rPr>
+          <w:u w:val="single"/>
+          <w:rtl w:val="0"/>
+        </w:rPr>
+        <w:t xml:space="preserve">Search Placeholder Overlaps Language Switch</w:t>
+      </w:r>
+      <w:r>
+        <w:rPr>
+          <w:rtl w:val="0"/>
+        </w:rPr>
+      </w:r>
+    </w:p>
+    <w:p>
+      <w:pPr>
+        <w:ind w:left="-425.19685039370086" w:hanging="420"/>
+        <w:rPr/>
+      </w:pPr>
+      <w:r>
+        <w:rPr>
+          <w:rtl w:val="0"/>
+        </w:rPr>
+        <w:t xml:space="preserve">       </w:t>
+      </w:r>
+    </w:p>
+    <w:p>
+      <w:pPr>
+        <w:ind w:left="-425.19685039370086" w:hanging="420"/>
+        <w:rPr>
+          <w:b w:val="1"/>
+        </w:rPr>
+      </w:pPr>
+      <w:r>
+        <w:rPr>
+          <w:rtl w:val="0"/>
+        </w:rPr>
+        <w:t xml:space="preserve">       </w:t>
+      </w:r>
+      <w:r>
+        <w:rPr>
+          <w:b w:val="1"/>
+          <w:rtl w:val="0"/>
+        </w:rPr>
+        <w:t xml:space="preserve">Type:</w:t>
+      </w:r>
+      <w:r>
+        <w:rPr>
+          <w:rtl w:val="0"/>
+        </w:rPr>
+        <w:t xml:space="preserve"> UI</w:t>
+        <w:br w:type="textWrapping"/>
+      </w:r>
+      <w:r>
+        <w:rPr>
+          <w:b w:val="1"/>
+          <w:rtl w:val="0"/>
+        </w:rPr>
+        <w:t xml:space="preserve">Steps to Reproduce:</w:t>
+      </w:r>
+    </w:p>
+    <w:p>
+      <w:pPr>
+        <w:ind w:left="0" w:firstLine="0"/>
+        <w:rPr/>
+      </w:pPr>
+      <w:r>
+        <w:rPr>
+          <w:rtl w:val="0"/>
+        </w:rPr>
+        <w:t xml:space="preserve">1.Open the Daraz app.</w:t>
+        <w:br w:type="textWrapping"/>
+        <w:t xml:space="preserve">2.Go to the search bar at the top.</w:t>
+        <w:br w:type="textWrapping"/>
+        <w:t xml:space="preserve">3.Switch the language (e.g., Urdu to English or vice versa).</w:t>
+      </w:r>
+    </w:p>
+    <w:p>
+      <w:pPr>
+        <w:ind w:left="0" w:hanging="425.19685039370086"/>
+        <w:rPr/>
+      </w:pPr>
+      <w:r>
+        <w:rPr>
+          <w:b w:val="1"/>
+          <w:rtl w:val="0"/>
+        </w:rPr>
+        <w:t xml:space="preserve">Issue:</w:t>
+      </w:r>
+      <w:r>
+        <w:rPr>
+          <w:rtl w:val="0"/>
+        </w:rPr>
+        <w:t xml:space="preserve"> The placeholder text (</w:t>
+      </w:r>
+      <w:r>
+        <w:rPr>
+          <w:rFonts w:ascii="Roboto Mono" w:cs="Roboto Mono" w:eastAsia="Roboto Mono" w:hAnsi="Roboto Mono"/>
+          <w:rtl w:val="0"/>
+        </w:rPr>
+        <w:t xml:space="preserve">Search in Daraz</w:t>
+      </w:r>
+      <w:r>
+        <w:rPr>
+          <w:rtl w:val="0"/>
+        </w:rPr>
+        <w:t xml:space="preserve">) overlaps with the language icon.</w:t>
+      </w:r>
+    </w:p>
+    <w:p>
+      <w:pPr>
+        <w:ind w:left="0" w:hanging="425.19685039370086"/>
+        <w:rPr/>
+      </w:pPr>
+      <w:r>
+        <w:rPr>
+          <w:b w:val="1"/>
+          <w:rtl w:val="0"/>
+        </w:rPr>
+        <w:t xml:space="preserve">Expected:</w:t>
+      </w:r>
+      <w:r>
+        <w:rPr>
+          <w:rtl w:val="0"/>
+        </w:rPr>
+        <w:t xml:space="preserve"> Placeholder should adjust spacing dynamically based on screen content.</w:t>
+        <w:br w:type="textWrapping"/>
+      </w:r>
+    </w:p>
+    <w:p>
+      <w:pPr>
+        <w:ind w:left="-425.19685039370086" w:hanging="420"/>
+        <w:rPr/>
+      </w:pPr>
+      <w:r>
+        <w:pict>
+          <v:rect style="width:0.0pt;height:1.5pt" o:hr="t" o:hrstd="t" o:hralign="center" fillcolor="#A0A0A0" stroked="f"/>
+        </w:pict>
+      </w:r>
+      <w:r>
+        <w:rPr>
+          <w:rtl w:val="0"/>
+        </w:rPr>
+      </w:r>
+    </w:p>
+    <w:p>
+      <w:pPr>
+        <w:pStyle w:val="Heading3"/>
+        <w:keepNext w:val="0"/>
+        <w:keepLines w:val="0"/>
+        <w:spacing w:before="280" w:lineRule="auto"/>
+        <w:ind w:left="-425.19685039370086" w:hanging="420"/>
+        <w:rPr>
+          <w:color w:val="000000"/>
+          <w:sz w:val="22"/>
+          <w:szCs w:val="22"/>
+          <w:u w:val="single"/>
+        </w:rPr>
+      </w:pPr>
+      <w:bookmarkStart w:colFirst="0" w:colLast="0" w:name="_klsgqk4e2v1h" w:id="1"/>
+      <w:bookmarkEnd w:id="1"/>
+      <w:r>
+        <w:rPr>
+          <w:color w:val="000000"/>
+          <w:sz w:val="22"/>
+          <w:szCs w:val="22"/>
+          <w:rtl w:val="0"/>
+        </w:rPr>
+        <w:t xml:space="preserve">       </w:t>
+      </w:r>
+      <w:r>
+        <w:rPr>
+          <w:b w:val="1"/>
+          <w:color w:val="000000"/>
+          <w:sz w:val="22"/>
+          <w:szCs w:val="22"/>
+          <w:rtl w:val="0"/>
+        </w:rPr>
+        <w:t xml:space="preserve">Bug 2:</w:t>
+      </w:r>
+      <w:r>
+        <w:rPr>
+          <w:color w:val="000000"/>
+          <w:sz w:val="22"/>
+          <w:szCs w:val="22"/>
+          <w:rtl w:val="0"/>
+        </w:rPr>
+        <w:t xml:space="preserve"> </w:t>
+      </w:r>
+      <w:r>
+        <w:rPr>
+          <w:color w:val="000000"/>
+          <w:sz w:val="22"/>
+          <w:szCs w:val="22"/>
+          <w:u w:val="single"/>
+          <w:rtl w:val="0"/>
+        </w:rPr>
+        <w:t xml:space="preserve">Login with OTP - No Input Validation</w:t>
+      </w:r>
+    </w:p>
+    <w:p>
+      <w:pPr>
+        <w:pStyle w:val="Heading3"/>
+        <w:keepNext w:val="0"/>
+        <w:keepLines w:val="0"/>
+        <w:spacing w:before="280" w:lineRule="auto"/>
+        <w:ind w:left="-425.19685039370086" w:hanging="420"/>
+        <w:rPr>
+          <w:color w:val="000000"/>
+          <w:sz w:val="22"/>
+          <w:szCs w:val="22"/>
+        </w:rPr>
+      </w:pPr>
+      <w:bookmarkStart w:colFirst="0" w:colLast="0" w:name="_2csbo527zzp6" w:id="2"/>
+      <w:bookmarkEnd w:id="2"/>
+      <w:r>
+        <w:rPr>
+          <w:color w:val="000000"/>
+          <w:sz w:val="22"/>
+          <w:szCs w:val="22"/>
+          <w:rtl w:val="0"/>
+        </w:rPr>
+        <w:t xml:space="preserve">       </w:t>
+      </w:r>
+      <w:r>
+        <w:rPr>
+          <w:b w:val="1"/>
+          <w:color w:val="000000"/>
+          <w:sz w:val="22"/>
+          <w:szCs w:val="22"/>
+          <w:rtl w:val="0"/>
+        </w:rPr>
+        <w:t xml:space="preserve">Type: Functionality</w:t>
+      </w:r>
+      <w:r>
+        <w:rPr>
+          <w:b w:val="1"/>
+          <w:color w:val="000000"/>
+          <w:rtl w:val="0"/>
+        </w:rPr>
+        <w:br w:type="textWrapping"/>
+      </w:r>
+      <w:r>
+        <w:rPr>
+          <w:b w:val="1"/>
+          <w:color w:val="000000"/>
+          <w:sz w:val="22"/>
+          <w:szCs w:val="22"/>
+          <w:rtl w:val="0"/>
+        </w:rPr>
+        <w:t xml:space="preserve">Steps to Reproduce:</w:t>
+      </w:r>
+      <w:r>
+        <w:rPr>
+          <w:b w:val="1"/>
+          <w:rtl w:val="0"/>
+        </w:rPr>
+        <w:br w:type="textWrapping"/>
+        <w:tab/>
+      </w:r>
+      <w:r>
+        <w:rPr>
+          <w:b w:val="1"/>
+          <w:color w:val="000000"/>
+          <w:sz w:val="22"/>
+          <w:szCs w:val="22"/>
+          <w:rtl w:val="0"/>
+        </w:rPr>
+        <w:t xml:space="preserve">1</w:t>
+      </w:r>
+      <w:r>
+        <w:rPr>
+          <w:b w:val="1"/>
+          <w:rtl w:val="0"/>
+        </w:rPr>
+        <w:t xml:space="preserve">.</w:t>
+      </w:r>
+      <w:r>
+        <w:rPr>
+          <w:color w:val="000000"/>
+          <w:sz w:val="22"/>
+          <w:szCs w:val="22"/>
+          <w:rtl w:val="0"/>
+        </w:rPr>
+        <w:t xml:space="preserve">Click "Sign Up".</w:t>
+        <w:br w:type="textWrapping"/>
+        <w:tab/>
+        <w:t xml:space="preserve">2.Enter an invalid phone number (e.g., 123).</w:t>
+        <w:br w:type="textWrapping"/>
+        <w:tab/>
+        <w:t xml:space="preserve">3.Press "Send code via WhatsApp".</w:t>
+        <w:br w:type="textWrapping"/>
+      </w:r>
+      <w:r>
+        <w:rPr>
+          <w:b w:val="1"/>
+          <w:color w:val="000000"/>
+          <w:sz w:val="22"/>
+          <w:szCs w:val="22"/>
+          <w:rtl w:val="0"/>
+        </w:rPr>
+        <w:t xml:space="preserve">Issue:</w:t>
+      </w:r>
+      <w:r>
+        <w:rPr>
+          <w:color w:val="000000"/>
+          <w:sz w:val="22"/>
+          <w:szCs w:val="22"/>
+          <w:rtl w:val="0"/>
+        </w:rPr>
+        <w:t xml:space="preserve"> App accepts invalid phone format without immediate feedback.</w:t>
+        <w:br w:type="textWrapping"/>
+      </w:r>
+      <w:r>
+        <w:rPr>
+          <w:b w:val="1"/>
+          <w:color w:val="000000"/>
+          <w:sz w:val="22"/>
+          <w:szCs w:val="22"/>
+          <w:rtl w:val="0"/>
+        </w:rPr>
+        <w:t xml:space="preserve">Expected:</w:t>
+      </w:r>
+      <w:r>
+        <w:rPr>
+          <w:color w:val="000000"/>
+          <w:sz w:val="22"/>
+          <w:szCs w:val="22"/>
+          <w:rtl w:val="0"/>
+        </w:rPr>
+        <w:t xml:space="preserve"> Error message or format validation before proceeding.</w:t>
+        <w:br w:type="textWrapping"/>
+      </w:r>
+    </w:p>
+    <w:p>
+      <w:pPr>
+        <w:ind w:left="-425.19685039370086" w:hanging="420"/>
+        <w:rPr/>
+      </w:pPr>
+      <w:r>
+        <w:pict>
+          <v:rect style="width:0.0pt;height:1.5pt" o:hr="t" o:hrstd="t" o:hralign="center" fillcolor="#A0A0A0" stroked="f"/>
+        </w:pict>
+      </w:r>
+      <w:r>
+        <w:rPr>
+          <w:rtl w:val="0"/>
+        </w:rPr>
+      </w:r>
+    </w:p>
+    <w:p>
+      <w:pPr>
+        <w:pStyle w:val="Heading3"/>
+        <w:keepNext w:val="0"/>
+        <w:keepLines w:val="0"/>
+        <w:spacing w:before="280" w:lineRule="auto"/>
+        <w:ind w:left="-425.19685039370086" w:hanging="420"/>
+        <w:rPr>
+          <w:color w:val="000000"/>
+          <w:sz w:val="22"/>
+          <w:szCs w:val="22"/>
+          <w:u w:val="single"/>
+        </w:rPr>
+      </w:pPr>
+      <w:bookmarkStart w:colFirst="0" w:colLast="0" w:name="_s906ubawtjtj" w:id="3"/>
+      <w:bookmarkEnd w:id="3"/>
+      <w:r>
+        <w:rPr>
+          <w:color w:val="000000"/>
+          <w:sz w:val="22"/>
+          <w:szCs w:val="22"/>
+          <w:rtl w:val="0"/>
+        </w:rPr>
+        <w:t xml:space="preserve">     </w:t>
+      </w:r>
+      <w:r>
+        <w:rPr>
+          <w:b w:val="1"/>
+          <w:color w:val="000000"/>
+          <w:sz w:val="22"/>
+          <w:szCs w:val="22"/>
+          <w:rtl w:val="0"/>
+        </w:rPr>
+        <w:t xml:space="preserve">Bug 3:</w:t>
+      </w:r>
+      <w:r>
+        <w:rPr>
+          <w:color w:val="000000"/>
+          <w:sz w:val="22"/>
+          <w:szCs w:val="22"/>
+          <w:rtl w:val="0"/>
+        </w:rPr>
+        <w:t xml:space="preserve"> </w:t>
+      </w:r>
+      <w:r>
+        <w:rPr>
+          <w:color w:val="000000"/>
+          <w:sz w:val="22"/>
+          <w:szCs w:val="22"/>
+          <w:u w:val="single"/>
+          <w:rtl w:val="0"/>
+        </w:rPr>
+        <w:t xml:space="preserve">Button Hidden Behind Keyboard</w:t>
+      </w:r>
+    </w:p>
+    <w:p>
+      <w:pPr>
+        <w:pStyle w:val="Heading3"/>
+        <w:keepNext w:val="0"/>
+        <w:keepLines w:val="0"/>
+        <w:spacing w:before="280" w:lineRule="auto"/>
+        <w:ind w:left="-425.19685039370086" w:hanging="420"/>
+        <w:rPr>
+          <w:color w:val="000000"/>
+          <w:sz w:val="22"/>
+          <w:szCs w:val="22"/>
+        </w:rPr>
+      </w:pPr>
+      <w:bookmarkStart w:colFirst="0" w:colLast="0" w:name="_8ul77if5stm2" w:id="4"/>
+      <w:bookmarkEnd w:id="4"/>
+      <w:r>
+        <w:rPr>
+          <w:rtl w:val="0"/>
+        </w:rPr>
+        <w:t xml:space="preserve">    </w:t>
+      </w:r>
+      <w:r>
+        <w:rPr>
+          <w:b w:val="1"/>
+          <w:color w:val="000000"/>
+          <w:sz w:val="22"/>
+          <w:szCs w:val="22"/>
+          <w:rtl w:val="0"/>
+        </w:rPr>
+        <w:t xml:space="preserve">Type:</w:t>
+      </w:r>
+      <w:r>
+        <w:rPr>
+          <w:color w:val="000000"/>
+          <w:sz w:val="22"/>
+          <w:szCs w:val="22"/>
+          <w:rtl w:val="0"/>
+        </w:rPr>
+        <w:t xml:space="preserve"> Usability</w:t>
+      </w:r>
+    </w:p>
+    <w:p>
+      <w:pPr>
+        <w:pStyle w:val="Heading3"/>
+        <w:keepNext w:val="0"/>
+        <w:keepLines w:val="0"/>
+        <w:spacing w:before="280" w:lineRule="auto"/>
+        <w:ind w:left="-425.19685039370086" w:hanging="420"/>
+        <w:rPr/>
+      </w:pPr>
+      <w:bookmarkStart w:colFirst="0" w:colLast="0" w:name="_ecpo3xx2fs38" w:id="5"/>
+      <w:bookmarkEnd w:id="5"/>
+      <w:r>
+        <w:rPr>
+          <w:color w:val="000000"/>
+          <w:sz w:val="22"/>
+          <w:szCs w:val="22"/>
+          <w:rtl w:val="0"/>
+        </w:rPr>
+        <w:t xml:space="preserve">     </w:t>
+      </w:r>
+      <w:r>
+        <w:rPr>
+          <w:b w:val="1"/>
+          <w:color w:val="000000"/>
+          <w:sz w:val="22"/>
+          <w:szCs w:val="22"/>
+          <w:rtl w:val="0"/>
+        </w:rPr>
+        <w:t xml:space="preserve">Steps to Reproduce:</w:t>
+      </w:r>
+      <w:r>
+        <w:rPr>
+          <w:color w:val="000000"/>
+          <w:sz w:val="22"/>
+          <w:szCs w:val="22"/>
+          <w:rtl w:val="0"/>
+        </w:rPr>
+        <w:br w:type="textWrapping"/>
+        <w:tab/>
+        <w:t xml:space="preserve">1.Try logging in via email.</w:t>
+        <w:br w:type="textWrapping"/>
+        <w:tab/>
+        <w:t xml:space="preserve">2.Tap the input field to bring up the keyboard.</w:t>
+      </w:r>
+      <w:r>
+        <w:rPr>
+          <w:rtl w:val="0"/>
+        </w:rPr>
+        <w:br w:type="textWrapping"/>
+      </w:r>
+      <w:r>
+        <w:rPr>
+          <w:b w:val="1"/>
+          <w:color w:val="000000"/>
+          <w:sz w:val="22"/>
+          <w:szCs w:val="22"/>
+          <w:rtl w:val="0"/>
+        </w:rPr>
+        <w:t xml:space="preserve">Issue:</w:t>
+      </w:r>
+      <w:r>
+        <w:rPr>
+          <w:color w:val="000000"/>
+          <w:sz w:val="22"/>
+          <w:szCs w:val="22"/>
+          <w:rtl w:val="0"/>
+        </w:rPr>
+        <w:t xml:space="preserve"> The login button is pushed below the screen and becomes unreachable unless the keyboard is dismissed.</w:t>
+        <w:br w:type="textWrapping"/>
+      </w:r>
+      <w:r>
+        <w:rPr>
+          <w:b w:val="1"/>
+          <w:color w:val="000000"/>
+          <w:sz w:val="22"/>
+          <w:szCs w:val="22"/>
+          <w:rtl w:val="0"/>
+        </w:rPr>
+        <w:t xml:space="preserve">Expected:</w:t>
+      </w:r>
+      <w:r>
+        <w:rPr>
+          <w:color w:val="000000"/>
+          <w:sz w:val="22"/>
+          <w:szCs w:val="22"/>
+          <w:rtl w:val="0"/>
+        </w:rPr>
+        <w:t xml:space="preserve"> Screen should auto-scroll or resize to keep buttons visible.</w:t>
+      </w:r>
+      <w:r>
+        <w:rPr>
+          <w:rtl w:val="0"/>
+        </w:rPr>
+        <w:br w:type="textWrapping"/>
+      </w:r>
+    </w:p>
+    <w:p>
+      <w:pPr>
+        <w:ind w:left="-425.19685039370086" w:hanging="420"/>
+        <w:rPr/>
+      </w:pPr>
+      <w:r>
+        <w:pict>
+          <v:rect style="width:0.0pt;height:1.5pt" o:hr="t" o:hrstd="t" o:hralign="center" fillcolor="#A0A0A0" stroked="f"/>
+        </w:pict>
+      </w:r>
+      <w:r>
+        <w:rPr>
+          <w:rtl w:val="0"/>
+        </w:rPr>
+      </w:r>
+    </w:p>
+    <w:p>
+      <w:pPr>
+        <w:pStyle w:val="Heading3"/>
+        <w:keepNext w:val="0"/>
+        <w:keepLines w:val="0"/>
+        <w:spacing w:before="280" w:lineRule="auto"/>
+        <w:ind w:left="-425.19685039370086" w:hanging="420"/>
+        <w:rPr>
+          <w:color w:val="000000"/>
+          <w:sz w:val="22"/>
+          <w:szCs w:val="22"/>
+          <w:u w:val="single"/>
+        </w:rPr>
+      </w:pPr>
+      <w:bookmarkStart w:colFirst="0" w:colLast="0" w:name="_aan9n7jo6wzb" w:id="6"/>
+      <w:bookmarkEnd w:id="6"/>
+      <w:r>
+        <w:rPr>
+          <w:color w:val="000000"/>
+          <w:sz w:val="22"/>
+          <w:szCs w:val="22"/>
+          <w:rtl w:val="0"/>
+        </w:rPr>
+        <w:t xml:space="preserve">  </w:t>
+      </w:r>
+      <w:r>
+        <w:rPr>
+          <w:b w:val="1"/>
+          <w:color w:val="000000"/>
+          <w:sz w:val="22"/>
+          <w:szCs w:val="22"/>
+          <w:rtl w:val="0"/>
+        </w:rPr>
+        <w:t xml:space="preserve">    Bug 4:</w:t>
+      </w:r>
+      <w:r>
+        <w:rPr>
+          <w:color w:val="000000"/>
+          <w:sz w:val="22"/>
+          <w:szCs w:val="22"/>
+          <w:rtl w:val="0"/>
+        </w:rPr>
+        <w:t xml:space="preserve"> </w:t>
+      </w:r>
+      <w:r>
+        <w:rPr>
+          <w:color w:val="000000"/>
+          <w:sz w:val="22"/>
+          <w:szCs w:val="22"/>
+          <w:u w:val="single"/>
+          <w:rtl w:val="0"/>
+        </w:rPr>
+        <w:t xml:space="preserve">Cart Icon Does not Update Quantity in Real Time</w:t>
+      </w:r>
+    </w:p>
+    <w:p>
+      <w:pPr>
+        <w:pStyle w:val="Heading3"/>
+        <w:keepNext w:val="0"/>
+        <w:keepLines w:val="0"/>
+        <w:spacing w:before="280" w:lineRule="auto"/>
+        <w:ind w:left="-425.19685039370086" w:hanging="420"/>
+        <w:rPr>
+          <w:color w:val="000000"/>
+          <w:sz w:val="22"/>
+          <w:szCs w:val="22"/>
+        </w:rPr>
+      </w:pPr>
+      <w:bookmarkStart w:colFirst="0" w:colLast="0" w:name="_557emdgmionx" w:id="7"/>
+      <w:bookmarkEnd w:id="7"/>
+      <w:r>
+        <w:rPr>
+          <w:color w:val="000000"/>
+          <w:sz w:val="22"/>
+          <w:szCs w:val="22"/>
+          <w:rtl w:val="0"/>
+        </w:rPr>
+        <w:t xml:space="preserve">      </w:t>
+      </w:r>
+      <w:r>
+        <w:rPr>
+          <w:b w:val="1"/>
+          <w:color w:val="000000"/>
+          <w:sz w:val="22"/>
+          <w:szCs w:val="22"/>
+          <w:rtl w:val="0"/>
+        </w:rPr>
+        <w:t xml:space="preserve">Type:</w:t>
+      </w:r>
+      <w:r>
+        <w:rPr>
+          <w:color w:val="000000"/>
+          <w:sz w:val="22"/>
+          <w:szCs w:val="22"/>
+          <w:rtl w:val="0"/>
+        </w:rPr>
+        <w:t xml:space="preserve"> Functionality</w:t>
+        <w:br w:type="textWrapping"/>
+      </w:r>
+      <w:r>
+        <w:rPr>
+          <w:b w:val="1"/>
+          <w:color w:val="000000"/>
+          <w:sz w:val="22"/>
+          <w:szCs w:val="22"/>
+          <w:rtl w:val="0"/>
+        </w:rPr>
+        <w:t xml:space="preserve">Steps to Reproduce:</w:t>
+      </w:r>
+      <w:r>
+        <w:rPr>
+          <w:color w:val="000000"/>
+          <w:sz w:val="22"/>
+          <w:szCs w:val="22"/>
+          <w:rtl w:val="0"/>
+        </w:rPr>
+        <w:br w:type="textWrapping"/>
+        <w:tab/>
+        <w:t xml:space="preserve">1.Add multiple items to the cart.</w:t>
+        <w:br w:type="textWrapping"/>
+        <w:tab/>
+        <w:t xml:space="preserve">2.Navigate to another product and click add to cart again.</w:t>
+        <w:br w:type="textWrapping"/>
+      </w:r>
+      <w:r>
+        <w:rPr>
+          <w:b w:val="1"/>
+          <w:color w:val="000000"/>
+          <w:sz w:val="22"/>
+          <w:szCs w:val="22"/>
+          <w:rtl w:val="0"/>
+        </w:rPr>
+        <w:t xml:space="preserve">Issue:</w:t>
+      </w:r>
+      <w:r>
+        <w:rPr>
+          <w:color w:val="000000"/>
+          <w:sz w:val="22"/>
+          <w:szCs w:val="22"/>
+          <w:rtl w:val="0"/>
+        </w:rPr>
+        <w:t xml:space="preserve"> The cart icon quantity does not update unless the page is refreshed.</w:t>
+        <w:br w:type="textWrapping"/>
+      </w:r>
+      <w:r>
+        <w:rPr>
+          <w:b w:val="1"/>
+          <w:color w:val="000000"/>
+          <w:sz w:val="22"/>
+          <w:szCs w:val="22"/>
+          <w:rtl w:val="0"/>
+        </w:rPr>
+        <w:t xml:space="preserve">Expected:</w:t>
+      </w:r>
+      <w:r>
+        <w:rPr>
+          <w:color w:val="000000"/>
+          <w:sz w:val="22"/>
+          <w:szCs w:val="22"/>
+          <w:rtl w:val="0"/>
+        </w:rPr>
+        <w:t xml:space="preserve"> Cart quantity should update in real-time.</w:t>
+        <w:br w:type="textWrapping"/>
+      </w:r>
+    </w:p>
+    <w:p>
+      <w:pPr>
+        <w:ind w:left="-425.19685039370086" w:hanging="420"/>
+        <w:rPr/>
+      </w:pPr>
+      <w:r>
+        <w:pict>
+          <v:rect style="width:0.0pt;height:1.5pt" o:hr="t" o:hrstd="t" o:hralign="center" fillcolor="#A0A0A0" stroked="f"/>
+        </w:pict>
+      </w:r>
+      <w:r>
+        <w:rPr>
+          <w:rtl w:val="0"/>
+        </w:rPr>
+      </w:r>
+    </w:p>
+    <w:p>
+      <w:pPr>
+        <w:pStyle w:val="Heading3"/>
+        <w:keepNext w:val="0"/>
+        <w:keepLines w:val="0"/>
+        <w:spacing w:before="280" w:lineRule="auto"/>
+        <w:ind w:left="-425.19685039370086" w:hanging="420"/>
+        <w:rPr>
+          <w:color w:val="000000"/>
+          <w:sz w:val="22"/>
+          <w:szCs w:val="22"/>
+          <w:u w:val="single"/>
+        </w:rPr>
+      </w:pPr>
+      <w:bookmarkStart w:colFirst="0" w:colLast="0" w:name="_i22gq5bnwcnu" w:id="8"/>
+      <w:bookmarkEnd w:id="8"/>
+      <w:r>
+        <w:rPr>
+          <w:color w:val="000000"/>
+          <w:sz w:val="22"/>
+          <w:szCs w:val="22"/>
+          <w:rtl w:val="0"/>
+        </w:rPr>
+        <w:t xml:space="preserve">       </w:t>
+      </w:r>
+      <w:r>
+        <w:rPr>
+          <w:b w:val="1"/>
+          <w:color w:val="000000"/>
+          <w:sz w:val="22"/>
+          <w:szCs w:val="22"/>
+          <w:rtl w:val="0"/>
+        </w:rPr>
+        <w:t xml:space="preserve">Bug 5: </w:t>
+      </w:r>
+      <w:r>
+        <w:rPr>
+          <w:color w:val="000000"/>
+          <w:sz w:val="22"/>
+          <w:szCs w:val="22"/>
+          <w:u w:val="single"/>
+          <w:rtl w:val="0"/>
+        </w:rPr>
+        <w:t xml:space="preserve">Inconsistent Font Sizes Across Pages</w:t>
+      </w:r>
+    </w:p>
+    <w:p>
+      <w:pPr>
+        <w:pStyle w:val="Heading3"/>
+        <w:keepNext w:val="0"/>
+        <w:keepLines w:val="0"/>
+        <w:spacing w:before="280" w:lineRule="auto"/>
+        <w:ind w:left="-425.19685039370086" w:hanging="420"/>
+        <w:rPr>
+          <w:color w:val="000000"/>
+          <w:sz w:val="22"/>
+          <w:szCs w:val="22"/>
+        </w:rPr>
+      </w:pPr>
+      <w:bookmarkStart w:colFirst="0" w:colLast="0" w:name="_trolvcq2663w" w:id="9"/>
+      <w:bookmarkEnd w:id="9"/>
+      <w:r>
+        <w:rPr>
+          <w:color w:val="000000"/>
+          <w:sz w:val="22"/>
+          <w:szCs w:val="22"/>
+          <w:rtl w:val="0"/>
+        </w:rPr>
+        <w:t xml:space="preserve">       </w:t>
+      </w:r>
+      <w:r>
+        <w:rPr>
+          <w:b w:val="1"/>
+          <w:color w:val="000000"/>
+          <w:sz w:val="22"/>
+          <w:szCs w:val="22"/>
+          <w:rtl w:val="0"/>
+        </w:rPr>
+        <w:t xml:space="preserve">Type:</w:t>
+      </w:r>
+      <w:r>
+        <w:rPr>
+          <w:color w:val="000000"/>
+          <w:sz w:val="22"/>
+          <w:szCs w:val="22"/>
+          <w:rtl w:val="0"/>
+        </w:rPr>
+        <w:t xml:space="preserve"> UI</w:t>
+        <w:br w:type="textWrapping"/>
+      </w:r>
+      <w:r>
+        <w:rPr>
+          <w:b w:val="1"/>
+          <w:color w:val="000000"/>
+          <w:sz w:val="22"/>
+          <w:szCs w:val="22"/>
+          <w:rtl w:val="0"/>
+        </w:rPr>
+        <w:t xml:space="preserve">Steps to Reproduce:</w:t>
+      </w:r>
+      <w:r>
+        <w:rPr>
+          <w:color w:val="000000"/>
+          <w:sz w:val="22"/>
+          <w:szCs w:val="22"/>
+          <w:rtl w:val="0"/>
+        </w:rPr>
+        <w:br w:type="textWrapping"/>
+        <w:tab/>
+        <w:t xml:space="preserve">1.Visit different product detail pages.</w:t>
+        <w:br w:type="textWrapping"/>
+        <w:tab/>
+        <w:t xml:space="preserve">2.Compare font sizes for price, description, and reviews.</w:t>
+        <w:br w:type="textWrapping"/>
+      </w:r>
+      <w:r>
+        <w:rPr>
+          <w:b w:val="1"/>
+          <w:color w:val="000000"/>
+          <w:sz w:val="22"/>
+          <w:szCs w:val="22"/>
+          <w:rtl w:val="0"/>
+        </w:rPr>
+        <w:t xml:space="preserve">Issue:</w:t>
+      </w:r>
+      <w:r>
+        <w:rPr>
+          <w:color w:val="000000"/>
+          <w:sz w:val="22"/>
+          <w:szCs w:val="22"/>
+          <w:rtl w:val="0"/>
+        </w:rPr>
+        <w:t xml:space="preserve"> Font sizes are inconsistent; some prices are tiny, others are bold and large.</w:t>
+        <w:br w:type="textWrapping"/>
+      </w:r>
+      <w:r>
+        <w:rPr>
+          <w:b w:val="1"/>
+          <w:color w:val="000000"/>
+          <w:sz w:val="22"/>
+          <w:szCs w:val="22"/>
+          <w:rtl w:val="0"/>
+        </w:rPr>
+        <w:t xml:space="preserve">Expected:</w:t>
+      </w:r>
+      <w:r>
+        <w:rPr>
+          <w:color w:val="000000"/>
+          <w:sz w:val="22"/>
+          <w:szCs w:val="22"/>
+          <w:rtl w:val="0"/>
+        </w:rPr>
+        <w:t xml:space="preserve"> Consistent font style and sizing for uniform appearance.</w:t>
+      </w:r>
+    </w:p>
+    <w:p>
+      <w:pPr>
+        <w:ind w:left="-425.19685039370086" w:hanging="420"/>
+        <w:rPr>
+          <w:b w:val="1"/>
         </w:rPr>
       </w:pPr>
       <w:r>

</xml_diff>